<commit_message>
ML model updated till decision tree and backend APIs
</commit_message>
<xml_diff>
--- a/Documentation/Milestone1 documentation.docx
+++ b/Documentation/Milestone1 documentation.docx
@@ -1299,14 +1299,6 @@
     </w:p>
     <w:p>
       <w:pPr>
-        <w:rPr>
-          <w:b/>
-          <w:bCs/>
-        </w:rPr>
-      </w:pPr>
-    </w:p>
-    <w:p>
-      <w:pPr>
         <w:ind w:left="0" w:firstLine="0"/>
       </w:pPr>
       <w:r>
@@ -1554,12 +1546,12 @@
     </w:p>
     <w:p>
       <w:r>
+        <w:t>Upper Bound = Q3 + 1.5 × IQR</w:t>
+      </w:r>
+    </w:p>
+    <w:p>
+      <w:r>
         <w:lastRenderedPageBreak/>
-        <w:t>Upper Bound = Q3 + 1.5 × IQR</w:t>
-      </w:r>
-    </w:p>
-    <w:p>
-      <w:r>
         <w:t>Outliers were observed in some numerical variables, particularly:</w:t>
       </w:r>
     </w:p>
@@ -1906,12 +1898,12 @@
           <w:b/>
           <w:bCs/>
         </w:rPr>
+        <w:t>Demand vs Units Sold</w:t>
+      </w:r>
+    </w:p>
+    <w:p>
+      <w:r>
         <w:lastRenderedPageBreak/>
-        <w:t>Demand vs Units Sold</w:t>
-      </w:r>
-    </w:p>
-    <w:p>
-      <w:r>
         <w:t>Correlation:</w:t>
       </w:r>
     </w:p>

</xml_diff>